<commit_message>
fix(sa): replace the funnel embedded in the deck, not just the loose png
The deck embeds seven images, and image7 was the old funnel still
reading 17,828 / 8,374 / 108. Swapping the file alone would have
stretched it, so the drawing frame height moves with the new aspect.
Restyled to the deck's navy so it does not read as pasted in.

Co-Authored-By: Claude Opus 5 <noreply@anthropic.com>
</commit_message>
<xml_diff>
--- a/docs/하남 SA 전략(수정본).docx
+++ b/docs/하남 SA 전략(수정본).docx
@@ -4050,7 +4050,7 @@
         <w:rPr/>
         <w:drawing>
           <wp:inline distB="0" distT="0" distL="0" distR="0">
-            <wp:extent cx="5903999" cy="1830746"/>
+            <wp:extent cx="5903999" cy="2546100"/>
             <wp:effectExtent b="0" l="0" r="0" t="0"/>
             <wp:docPr id="1" name="image7.png"/>
             <a:graphic>
@@ -4070,7 +4070,7 @@
                   <pic:spPr>
                     <a:xfrm>
                       <a:off x="0" y="0"/>
-                      <a:ext cx="5903999" cy="1830746"/>
+                      <a:ext cx="5903999" cy="2546100"/>
                     </a:xfrm>
                     <a:prstGeom prst="rect"/>
                     <a:ln/>

</xml_diff>

<commit_message>
docs(sa): even out table emphasis and drop the interim correction file
Rewriting run text left the original bold clinging to whichever row
happened to inherit it, so 전화 걸기 came out bold while its own 비중 did
not. Each table now follows one rule. The standalone correction doc is
gone since the deck itself carries every change.

Co-Authored-By: Claude Opus 5 <noreply@anthropic.com>
</commit_message>
<xml_diff>
--- a/docs/하남 SA 전략(수정본).docx
+++ b/docs/하남 SA 전략(수정본).docx
@@ -4817,6 +4817,7 @@
             </w:pPr>
             <w:r>
               <w:rPr>
+                <w:b w:val="0"/>
                 <w:sz w:val="16"/>
                 <w:szCs w:val="16"/>
                 <w:rtl w:val="0"/>
@@ -4825,6 +4826,7 @@
             </w:r>
             <w:r>
               <w:rPr>
+                <w:b w:val="0"/>
                 <w:rtl w:val="0"/>
               </w:rPr>
             </w:r>
@@ -4840,6 +4842,7 @@
             <w:commentRangeStart w:id="2"/>
             <w:r>
               <w:rPr>
+                <w:b w:val="0"/>
                 <w:sz w:val="16"/>
                 <w:szCs w:val="16"/>
                 <w:rtl w:val="0"/>
@@ -4847,23 +4850,29 @@
               <w:t>61</w:t>
             </w:r>
             <w:commentRangeEnd w:id="2"/>
-            <w:r/>
-            <w:r>
-              <w:rPr>
-                <w:rtl w:val="0"/>
-              </w:rPr>
-            </w:r>
-          </w:p>
-        </w:tc>
-        <w:tc>
-          <w:tcPr/>
-          <w:p>
-            <w:pPr>
-              <w:spacing w:after="24" w:before="24" w:lineRule="auto"/>
-              <w:rPr/>
-            </w:pPr>
-            <w:r>
-              <w:rPr>
+            <w:r>
+              <w:rPr>
+                <w:b w:val="0"/>
+              </w:rPr>
+            </w:r>
+            <w:r>
+              <w:rPr>
+                <w:b w:val="0"/>
+                <w:rtl w:val="0"/>
+              </w:rPr>
+            </w:r>
+          </w:p>
+        </w:tc>
+        <w:tc>
+          <w:tcPr/>
+          <w:p>
+            <w:pPr>
+              <w:spacing w:after="24" w:before="24" w:lineRule="auto"/>
+              <w:rPr/>
+            </w:pPr>
+            <w:r>
+              <w:rPr>
+                <w:b w:val="0"/>
                 <w:sz w:val="16"/>
                 <w:szCs w:val="16"/>
                 <w:rtl w:val="0"/>
@@ -4872,20 +4881,22 @@
             </w:r>
             <w:r>
               <w:rPr>
-                <w:rtl w:val="0"/>
-              </w:rPr>
-            </w:r>
-          </w:p>
-        </w:tc>
-        <w:tc>
-          <w:tcPr/>
-          <w:p>
-            <w:pPr>
-              <w:spacing w:after="24" w:before="24" w:lineRule="auto"/>
-              <w:rPr/>
-            </w:pPr>
-            <w:r>
-              <w:rPr>
+                <w:b w:val="0"/>
+                <w:rtl w:val="0"/>
+              </w:rPr>
+            </w:r>
+          </w:p>
+        </w:tc>
+        <w:tc>
+          <w:tcPr/>
+          <w:p>
+            <w:pPr>
+              <w:spacing w:after="24" w:before="24" w:lineRule="auto"/>
+              <w:rPr/>
+            </w:pPr>
+            <w:r>
+              <w:rPr>
+                <w:b w:val="0"/>
                 <w:sz w:val="16"/>
                 <w:szCs w:val="16"/>
                 <w:rtl w:val="0"/>
@@ -4894,6 +4905,7 @@
             </w:r>
             <w:r>
               <w:rPr>
+                <w:b w:val="0"/>
                 <w:rtl w:val="0"/>
               </w:rPr>
             </w:r>
@@ -4914,7 +4926,7 @@
             </w:pPr>
             <w:r>
               <w:rPr>
-                <w:b w:val="1"/>
+                <w:b/>
                 <w:bCs w:val="1"/>
                 <w:sz w:val="16"/>
                 <w:szCs w:val="16"/>
@@ -4924,6 +4936,7 @@
             </w:r>
             <w:r>
               <w:rPr>
+                <w:b/>
                 <w:rtl w:val="0"/>
               </w:rPr>
             </w:r>
@@ -4939,7 +4952,7 @@
             <w:commentRangeStart w:id="3"/>
             <w:r>
               <w:rPr>
-                <w:b w:val="1"/>
+                <w:b/>
                 <w:bCs w:val="1"/>
                 <w:sz w:val="16"/>
                 <w:szCs w:val="16"/>
@@ -4949,6 +4962,7 @@
             </w:r>
             <w:r>
               <w:rPr>
+                <w:b/>
                 <w:rtl w:val="0"/>
               </w:rPr>
             </w:r>
@@ -4963,34 +4977,38 @@
             </w:pPr>
             <w:commentRangeEnd w:id="3"/>
             <w:r>
+              <w:rPr>
+                <w:b/>
+              </w:rPr>
               <w:t>33.8%</w:t>
             </w:r>
             <w:r>
               <w:rPr>
-                <w:b w:val="1"/>
-                <w:bCs w:val="1"/>
-                <w:sz w:val="16"/>
-                <w:szCs w:val="16"/>
-                <w:rtl w:val="0"/>
-              </w:rPr>
-            </w:r>
-            <w:r>
-              <w:rPr>
-                <w:rtl w:val="0"/>
-              </w:rPr>
-            </w:r>
-          </w:p>
-        </w:tc>
-        <w:tc>
-          <w:tcPr/>
-          <w:p>
-            <w:pPr>
-              <w:spacing w:after="24" w:before="24" w:lineRule="auto"/>
-              <w:rPr/>
-            </w:pPr>
-            <w:r>
-              <w:rPr>
-                <w:b w:val="1"/>
+                <w:b/>
+                <w:bCs w:val="1"/>
+                <w:sz w:val="16"/>
+                <w:szCs w:val="16"/>
+                <w:rtl w:val="0"/>
+              </w:rPr>
+            </w:r>
+            <w:r>
+              <w:rPr>
+                <w:b/>
+                <w:rtl w:val="0"/>
+              </w:rPr>
+            </w:r>
+          </w:p>
+        </w:tc>
+        <w:tc>
+          <w:tcPr/>
+          <w:p>
+            <w:pPr>
+              <w:spacing w:after="24" w:before="24" w:lineRule="auto"/>
+              <w:rPr/>
+            </w:pPr>
+            <w:r>
+              <w:rPr>
+                <w:b/>
                 <w:bCs w:val="1"/>
                 <w:sz w:val="16"/>
                 <w:szCs w:val="16"/>
@@ -5000,6 +5018,7 @@
             </w:r>
             <w:r>
               <w:rPr>
+                <w:b/>
                 <w:rtl w:val="0"/>
               </w:rPr>
             </w:r>
@@ -5020,7 +5039,7 @@
             </w:pPr>
             <w:r>
               <w:rPr>
-                <w:b w:val="1"/>
+                <w:b/>
                 <w:bCs w:val="1"/>
                 <w:sz w:val="16"/>
                 <w:szCs w:val="16"/>
@@ -5030,6 +5049,7 @@
             </w:r>
             <w:r>
               <w:rPr>
+                <w:b/>
                 <w:rtl w:val="0"/>
               </w:rPr>
             </w:r>
@@ -5045,7 +5065,7 @@
             <w:commentRangeStart w:id="4"/>
             <w:r>
               <w:rPr>
-                <w:b w:val="1"/>
+                <w:b/>
                 <w:bCs w:val="1"/>
                 <w:sz w:val="16"/>
                 <w:szCs w:val="16"/>
@@ -5054,24 +5074,29 @@
               <w:t>16</w:t>
             </w:r>
             <w:commentRangeEnd w:id="4"/>
-            <w:r/>
-            <w:r>
-              <w:rPr>
-                <w:rtl w:val="0"/>
-              </w:rPr>
-            </w:r>
-          </w:p>
-        </w:tc>
-        <w:tc>
-          <w:tcPr/>
-          <w:p>
-            <w:pPr>
-              <w:spacing w:after="24" w:before="24" w:lineRule="auto"/>
-              <w:rPr/>
-            </w:pPr>
-            <w:r>
-              <w:rPr>
-                <w:b w:val="1"/>
+            <w:r>
+              <w:rPr>
+                <w:b/>
+              </w:rPr>
+            </w:r>
+            <w:r>
+              <w:rPr>
+                <w:b/>
+                <w:rtl w:val="0"/>
+              </w:rPr>
+            </w:r>
+          </w:p>
+        </w:tc>
+        <w:tc>
+          <w:tcPr/>
+          <w:p>
+            <w:pPr>
+              <w:spacing w:after="24" w:before="24" w:lineRule="auto"/>
+              <w:rPr/>
+            </w:pPr>
+            <w:r>
+              <w:rPr>
+                <w:b/>
                 <w:bCs w:val="1"/>
                 <w:sz w:val="16"/>
                 <w:szCs w:val="16"/>
@@ -5081,21 +5106,22 @@
             </w:r>
             <w:r>
               <w:rPr>
-                <w:rtl w:val="0"/>
-              </w:rPr>
-            </w:r>
-          </w:p>
-        </w:tc>
-        <w:tc>
-          <w:tcPr/>
-          <w:p>
-            <w:pPr>
-              <w:spacing w:after="24" w:before="24" w:lineRule="auto"/>
-              <w:rPr/>
-            </w:pPr>
-            <w:r>
-              <w:rPr>
-                <w:b w:val="1"/>
+                <w:b/>
+                <w:rtl w:val="0"/>
+              </w:rPr>
+            </w:r>
+          </w:p>
+        </w:tc>
+        <w:tc>
+          <w:tcPr/>
+          <w:p>
+            <w:pPr>
+              <w:spacing w:after="24" w:before="24" w:lineRule="auto"/>
+              <w:rPr/>
+            </w:pPr>
+            <w:r>
+              <w:rPr>
+                <w:b/>
                 <w:bCs w:val="1"/>
                 <w:sz w:val="16"/>
                 <w:szCs w:val="16"/>
@@ -5105,6 +5131,7 @@
             </w:r>
             <w:r>
               <w:rPr>
+                <w:b/>
                 <w:rtl w:val="0"/>
               </w:rPr>
             </w:r>
@@ -5125,6 +5152,7 @@
             </w:pPr>
             <w:r>
               <w:rPr>
+                <w:b w:val="0"/>
                 <w:sz w:val="16"/>
                 <w:szCs w:val="16"/>
                 <w:rtl w:val="0"/>
@@ -5133,6 +5161,7 @@
             </w:r>
             <w:r>
               <w:rPr>
+                <w:b w:val="0"/>
                 <w:rtl w:val="0"/>
               </w:rPr>
             </w:r>
@@ -5148,6 +5177,7 @@
             <w:commentRangeStart w:id="5"/>
             <w:r>
               <w:rPr>
+                <w:b w:val="0"/>
                 <w:sz w:val="16"/>
                 <w:szCs w:val="16"/>
                 <w:rtl w:val="0"/>
@@ -5155,23 +5185,29 @@
               <w:t>11</w:t>
             </w:r>
             <w:commentRangeEnd w:id="5"/>
-            <w:r/>
-            <w:r>
-              <w:rPr>
-                <w:rtl w:val="0"/>
-              </w:rPr>
-            </w:r>
-          </w:p>
-        </w:tc>
-        <w:tc>
-          <w:tcPr/>
-          <w:p>
-            <w:pPr>
-              <w:spacing w:after="24" w:before="24" w:lineRule="auto"/>
-              <w:rPr/>
-            </w:pPr>
-            <w:r>
-              <w:rPr>
+            <w:r>
+              <w:rPr>
+                <w:b w:val="0"/>
+              </w:rPr>
+            </w:r>
+            <w:r>
+              <w:rPr>
+                <w:b w:val="0"/>
+                <w:rtl w:val="0"/>
+              </w:rPr>
+            </w:r>
+          </w:p>
+        </w:tc>
+        <w:tc>
+          <w:tcPr/>
+          <w:p>
+            <w:pPr>
+              <w:spacing w:after="24" w:before="24" w:lineRule="auto"/>
+              <w:rPr/>
+            </w:pPr>
+            <w:r>
+              <w:rPr>
+                <w:b w:val="0"/>
                 <w:sz w:val="16"/>
                 <w:szCs w:val="16"/>
                 <w:rtl w:val="0"/>
@@ -5180,20 +5216,22 @@
             </w:r>
             <w:r>
               <w:rPr>
-                <w:rtl w:val="0"/>
-              </w:rPr>
-            </w:r>
-          </w:p>
-        </w:tc>
-        <w:tc>
-          <w:tcPr/>
-          <w:p>
-            <w:pPr>
-              <w:spacing w:after="24" w:before="24" w:lineRule="auto"/>
-              <w:rPr/>
-            </w:pPr>
-            <w:r>
-              <w:rPr>
+                <w:b w:val="0"/>
+                <w:rtl w:val="0"/>
+              </w:rPr>
+            </w:r>
+          </w:p>
+        </w:tc>
+        <w:tc>
+          <w:tcPr/>
+          <w:p>
+            <w:pPr>
+              <w:spacing w:after="24" w:before="24" w:lineRule="auto"/>
+              <w:rPr/>
+            </w:pPr>
+            <w:r>
+              <w:rPr>
+                <w:b w:val="0"/>
                 <w:sz w:val="16"/>
                 <w:szCs w:val="16"/>
                 <w:rtl w:val="0"/>
@@ -5202,6 +5240,7 @@
             </w:r>
             <w:r>
               <w:rPr>
+                <w:b w:val="0"/>
                 <w:rtl w:val="0"/>
               </w:rPr>
             </w:r>
@@ -5226,7 +5265,7 @@
             </w:pPr>
             <w:r>
               <w:rPr>
-                <w:b w:val="1"/>
+                <w:b/>
                 <w:bCs w:val="1"/>
                 <w:sz w:val="16"/>
                 <w:szCs w:val="16"/>
@@ -5236,6 +5275,7 @@
             </w:r>
             <w:r>
               <w:rPr>
+                <w:b/>
                 <w:rtl w:val="0"/>
               </w:rPr>
             </w:r>
@@ -5254,7 +5294,7 @@
             </w:pPr>
             <w:r>
               <w:rPr>
-                <w:b w:val="1"/>
+                <w:b/>
                 <w:bCs w:val="1"/>
                 <w:sz w:val="16"/>
                 <w:szCs w:val="16"/>
@@ -5264,6 +5304,7 @@
             </w:r>
             <w:r>
               <w:rPr>
+                <w:b/>
                 <w:rtl w:val="0"/>
               </w:rPr>
             </w:r>
@@ -5282,7 +5323,7 @@
             </w:pPr>
             <w:r>
               <w:rPr>
-                <w:b w:val="1"/>
+                <w:b/>
                 <w:bCs w:val="1"/>
                 <w:sz w:val="16"/>
                 <w:szCs w:val="16"/>
@@ -5292,6 +5333,7 @@
             </w:r>
             <w:r>
               <w:rPr>
+                <w:b/>
                 <w:rtl w:val="0"/>
               </w:rPr>
             </w:r>
@@ -5310,7 +5352,7 @@
             </w:pPr>
             <w:r>
               <w:rPr>
-                <w:b w:val="1"/>
+                <w:b/>
                 <w:bCs w:val="1"/>
                 <w:sz w:val="16"/>
                 <w:szCs w:val="16"/>
@@ -5320,6 +5362,7 @@
             </w:r>
             <w:r>
               <w:rPr>
+                <w:b/>
                 <w:rtl w:val="0"/>
               </w:rPr>
             </w:r>
@@ -7634,6 +7677,7 @@
             </w:pPr>
             <w:r>
               <w:rPr>
+                <w:b/>
                 <w:sz w:val="16"/>
                 <w:szCs w:val="16"/>
                 <w:rtl w:val="0"/>
@@ -7642,20 +7686,22 @@
             </w:r>
             <w:r>
               <w:rPr>
-                <w:rtl w:val="0"/>
-              </w:rPr>
-            </w:r>
-          </w:p>
-        </w:tc>
-        <w:tc>
-          <w:tcPr/>
-          <w:p>
-            <w:pPr>
-              <w:spacing w:after="24" w:before="24" w:lineRule="auto"/>
-              <w:rPr/>
-            </w:pPr>
-            <w:r>
-              <w:rPr>
+                <w:b/>
+                <w:rtl w:val="0"/>
+              </w:rPr>
+            </w:r>
+          </w:p>
+        </w:tc>
+        <w:tc>
+          <w:tcPr/>
+          <w:p>
+            <w:pPr>
+              <w:spacing w:after="24" w:before="24" w:lineRule="auto"/>
+              <w:rPr/>
+            </w:pPr>
+            <w:r>
+              <w:rPr>
+                <w:b/>
                 <w:sz w:val="16"/>
                 <w:szCs w:val="16"/>
                 <w:rtl w:val="0"/>
@@ -7664,20 +7710,22 @@
             </w:r>
             <w:r>
               <w:rPr>
-                <w:rtl w:val="0"/>
-              </w:rPr>
-            </w:r>
-          </w:p>
-        </w:tc>
-        <w:tc>
-          <w:tcPr/>
-          <w:p>
-            <w:pPr>
-              <w:spacing w:after="24" w:before="24" w:lineRule="auto"/>
-              <w:rPr/>
-            </w:pPr>
-            <w:r>
-              <w:rPr>
+                <w:b/>
+                <w:rtl w:val="0"/>
+              </w:rPr>
+            </w:r>
+          </w:p>
+        </w:tc>
+        <w:tc>
+          <w:tcPr/>
+          <w:p>
+            <w:pPr>
+              <w:spacing w:after="24" w:before="24" w:lineRule="auto"/>
+              <w:rPr/>
+            </w:pPr>
+            <w:r>
+              <w:rPr>
+                <w:b w:val="0"/>
                 <w:sz w:val="16"/>
                 <w:szCs w:val="16"/>
                 <w:rtl w:val="0"/>
@@ -7686,6 +7734,7 @@
             </w:r>
             <w:r>
               <w:rPr>
+                <w:b w:val="0"/>
                 <w:rtl w:val="0"/>
               </w:rPr>
             </w:r>
@@ -7706,7 +7755,7 @@
             </w:pPr>
             <w:r>
               <w:rPr>
-                <w:b w:val="1"/>
+                <w:b/>
                 <w:bCs w:val="1"/>
                 <w:sz w:val="16"/>
                 <w:szCs w:val="16"/>
@@ -7716,21 +7765,22 @@
             </w:r>
             <w:r>
               <w:rPr>
-                <w:rtl w:val="0"/>
-              </w:rPr>
-            </w:r>
-          </w:p>
-        </w:tc>
-        <w:tc>
-          <w:tcPr/>
-          <w:p>
-            <w:pPr>
-              <w:spacing w:after="24" w:before="24" w:lineRule="auto"/>
-              <w:rPr/>
-            </w:pPr>
-            <w:r>
-              <w:rPr>
-                <w:b w:val="1"/>
+                <w:b/>
+                <w:rtl w:val="0"/>
+              </w:rPr>
+            </w:r>
+          </w:p>
+        </w:tc>
+        <w:tc>
+          <w:tcPr/>
+          <w:p>
+            <w:pPr>
+              <w:spacing w:after="24" w:before="24" w:lineRule="auto"/>
+              <w:rPr/>
+            </w:pPr>
+            <w:r>
+              <w:rPr>
+                <w:b/>
                 <w:bCs w:val="1"/>
                 <w:sz w:val="16"/>
                 <w:szCs w:val="16"/>
@@ -7740,20 +7790,22 @@
             </w:r>
             <w:r>
               <w:rPr>
-                <w:rtl w:val="0"/>
-              </w:rPr>
-            </w:r>
-          </w:p>
-        </w:tc>
-        <w:tc>
-          <w:tcPr/>
-          <w:p>
-            <w:pPr>
-              <w:spacing w:after="24" w:before="24" w:lineRule="auto"/>
-              <w:rPr/>
-            </w:pPr>
-            <w:r>
-              <w:rPr>
+                <w:b/>
+                <w:rtl w:val="0"/>
+              </w:rPr>
+            </w:r>
+          </w:p>
+        </w:tc>
+        <w:tc>
+          <w:tcPr/>
+          <w:p>
+            <w:pPr>
+              <w:spacing w:after="24" w:before="24" w:lineRule="auto"/>
+              <w:rPr/>
+            </w:pPr>
+            <w:r>
+              <w:rPr>
+                <w:b w:val="0"/>
                 <w:sz w:val="16"/>
                 <w:szCs w:val="16"/>
                 <w:rtl w:val="0"/>
@@ -7762,6 +7814,7 @@
             </w:r>
             <w:r>
               <w:rPr>
+                <w:b w:val="0"/>
                 <w:rtl w:val="0"/>
               </w:rPr>
             </w:r>
@@ -7782,6 +7835,7 @@
             </w:pPr>
             <w:r>
               <w:rPr>
+                <w:b/>
                 <w:sz w:val="16"/>
                 <w:szCs w:val="16"/>
                 <w:rtl w:val="0"/>
@@ -7790,20 +7844,22 @@
             </w:r>
             <w:r>
               <w:rPr>
-                <w:rtl w:val="0"/>
-              </w:rPr>
-            </w:r>
-          </w:p>
-        </w:tc>
-        <w:tc>
-          <w:tcPr/>
-          <w:p>
-            <w:pPr>
-              <w:spacing w:after="24" w:before="24" w:lineRule="auto"/>
-              <w:rPr/>
-            </w:pPr>
-            <w:r>
-              <w:rPr>
+                <w:b/>
+                <w:rtl w:val="0"/>
+              </w:rPr>
+            </w:r>
+          </w:p>
+        </w:tc>
+        <w:tc>
+          <w:tcPr/>
+          <w:p>
+            <w:pPr>
+              <w:spacing w:after="24" w:before="24" w:lineRule="auto"/>
+              <w:rPr/>
+            </w:pPr>
+            <w:r>
+              <w:rPr>
+                <w:b/>
                 <w:sz w:val="16"/>
                 <w:szCs w:val="16"/>
                 <w:rtl w:val="0"/>
@@ -7812,20 +7868,22 @@
             </w:r>
             <w:r>
               <w:rPr>
-                <w:rtl w:val="0"/>
-              </w:rPr>
-            </w:r>
-          </w:p>
-        </w:tc>
-        <w:tc>
-          <w:tcPr/>
-          <w:p>
-            <w:pPr>
-              <w:spacing w:after="24" w:before="24" w:lineRule="auto"/>
-              <w:rPr/>
-            </w:pPr>
-            <w:r>
-              <w:rPr>
+                <w:b/>
+                <w:rtl w:val="0"/>
+              </w:rPr>
+            </w:r>
+          </w:p>
+        </w:tc>
+        <w:tc>
+          <w:tcPr/>
+          <w:p>
+            <w:pPr>
+              <w:spacing w:after="24" w:before="24" w:lineRule="auto"/>
+              <w:rPr/>
+            </w:pPr>
+            <w:r>
+              <w:rPr>
+                <w:b w:val="0"/>
                 <w:sz w:val="16"/>
                 <w:szCs w:val="16"/>
                 <w:rtl w:val="0"/>
@@ -7834,6 +7892,7 @@
             </w:r>
             <w:r>
               <w:rPr>
+                <w:b w:val="0"/>
                 <w:rtl w:val="0"/>
               </w:rPr>
             </w:r>
@@ -7854,7 +7913,7 @@
             </w:pPr>
             <w:r>
               <w:rPr>
-                <w:b w:val="1"/>
+                <w:b/>
                 <w:bCs w:val="1"/>
                 <w:sz w:val="16"/>
                 <w:szCs w:val="16"/>
@@ -7864,6 +7923,7 @@
             </w:r>
             <w:r>
               <w:rPr>
+                <w:b/>
                 <w:rtl w:val="0"/>
               </w:rPr>
             </w:r>
@@ -7879,7 +7939,7 @@
             <w:commentRangeStart w:id="6"/>
             <w:r>
               <w:rPr>
-                <w:b w:val="1"/>
+                <w:b/>
                 <w:bCs w:val="1"/>
                 <w:sz w:val="16"/>
                 <w:szCs w:val="16"/>
@@ -7888,32 +7948,38 @@
               <w:t>8,816,522 VND</w:t>
             </w:r>
             <w:commentRangeEnd w:id="6"/>
-            <w:r/>
-            <w:r>
-              <w:rPr>
-                <w:b w:val="1"/>
-                <w:bCs w:val="1"/>
-                <w:sz w:val="16"/>
-                <w:szCs w:val="16"/>
-                <w:rtl w:val="0"/>
-              </w:rPr>
-            </w:r>
-            <w:r>
-              <w:rPr>
-                <w:rtl w:val="0"/>
-              </w:rPr>
-            </w:r>
-          </w:p>
-        </w:tc>
-        <w:tc>
-          <w:tcPr/>
-          <w:p>
-            <w:pPr>
-              <w:spacing w:after="24" w:before="24" w:lineRule="auto"/>
-              <w:rPr/>
-            </w:pPr>
-            <w:r>
-              <w:rPr>
+            <w:r>
+              <w:rPr>
+                <w:b/>
+              </w:rPr>
+            </w:r>
+            <w:r>
+              <w:rPr>
+                <w:b/>
+                <w:bCs w:val="1"/>
+                <w:sz w:val="16"/>
+                <w:szCs w:val="16"/>
+                <w:rtl w:val="0"/>
+              </w:rPr>
+            </w:r>
+            <w:r>
+              <w:rPr>
+                <w:b/>
+                <w:rtl w:val="0"/>
+              </w:rPr>
+            </w:r>
+          </w:p>
+        </w:tc>
+        <w:tc>
+          <w:tcPr/>
+          <w:p>
+            <w:pPr>
+              <w:spacing w:after="24" w:before="24" w:lineRule="auto"/>
+              <w:rPr/>
+            </w:pPr>
+            <w:r>
+              <w:rPr>
+                <w:b w:val="0"/>
                 <w:sz w:val="16"/>
                 <w:szCs w:val="16"/>
                 <w:rtl w:val="0"/>
@@ -7922,6 +7988,7 @@
             </w:r>
             <w:r>
               <w:rPr>
+                <w:b w:val="0"/>
                 <w:rtl w:val="0"/>
               </w:rPr>
             </w:r>
@@ -7942,7 +8009,7 @@
             </w:pPr>
             <w:r>
               <w:rPr>
-                <w:b w:val="1"/>
+                <w:b/>
                 <w:bCs w:val="1"/>
                 <w:sz w:val="16"/>
                 <w:szCs w:val="16"/>
@@ -7952,21 +8019,22 @@
             </w:r>
             <w:r>
               <w:rPr>
-                <w:rtl w:val="0"/>
-              </w:rPr>
-            </w:r>
-          </w:p>
-        </w:tc>
-        <w:tc>
-          <w:tcPr/>
-          <w:p>
-            <w:pPr>
-              <w:spacing w:after="24" w:before="24" w:lineRule="auto"/>
-              <w:rPr/>
-            </w:pPr>
-            <w:r>
-              <w:rPr>
-                <w:b w:val="1"/>
+                <w:b/>
+                <w:rtl w:val="0"/>
+              </w:rPr>
+            </w:r>
+          </w:p>
+        </w:tc>
+        <w:tc>
+          <w:tcPr/>
+          <w:p>
+            <w:pPr>
+              <w:spacing w:after="24" w:before="24" w:lineRule="auto"/>
+              <w:rPr/>
+            </w:pPr>
+            <w:r>
+              <w:rPr>
+                <w:b/>
                 <w:bCs w:val="1"/>
                 <w:sz w:val="16"/>
                 <w:szCs w:val="16"/>
@@ -7976,20 +8044,22 @@
             </w:r>
             <w:r>
               <w:rPr>
-                <w:rtl w:val="0"/>
-              </w:rPr>
-            </w:r>
-          </w:p>
-        </w:tc>
-        <w:tc>
-          <w:tcPr/>
-          <w:p>
-            <w:pPr>
-              <w:spacing w:after="24" w:before="24" w:lineRule="auto"/>
-              <w:rPr/>
-            </w:pPr>
-            <w:r>
-              <w:rPr>
+                <w:b/>
+                <w:rtl w:val="0"/>
+              </w:rPr>
+            </w:r>
+          </w:p>
+        </w:tc>
+        <w:tc>
+          <w:tcPr/>
+          <w:p>
+            <w:pPr>
+              <w:spacing w:after="24" w:before="24" w:lineRule="auto"/>
+              <w:rPr/>
+            </w:pPr>
+            <w:r>
+              <w:rPr>
+                <w:b w:val="0"/>
                 <w:sz w:val="16"/>
                 <w:szCs w:val="16"/>
                 <w:rtl w:val="0"/>
@@ -7998,6 +8068,7 @@
             </w:r>
             <w:r>
               <w:rPr>
+                <w:b w:val="0"/>
                 <w:rtl w:val="0"/>
               </w:rPr>
             </w:r>
@@ -8018,7 +8089,7 @@
             </w:pPr>
             <w:r>
               <w:rPr>
-                <w:b w:val="1"/>
+                <w:b/>
                 <w:bCs w:val="1"/>
                 <w:sz w:val="16"/>
                 <w:szCs w:val="16"/>
@@ -8028,6 +8099,7 @@
             </w:r>
             <w:r>
               <w:rPr>
+                <w:b/>
                 <w:rtl w:val="0"/>
               </w:rPr>
             </w:r>
@@ -8043,7 +8115,7 @@
             <w:commentRangeStart w:id="7"/>
             <w:r>
               <w:rPr>
-                <w:b w:val="1"/>
+                <w:b/>
                 <w:bCs w:val="1"/>
                 <w:sz w:val="16"/>
                 <w:szCs w:val="16"/>
@@ -8052,32 +8124,38 @@
               <w:t>6,486  (44.5%)</w:t>
             </w:r>
             <w:commentRangeEnd w:id="7"/>
-            <w:r/>
-            <w:r>
-              <w:rPr>
-                <w:b w:val="1"/>
-                <w:bCs w:val="1"/>
-                <w:sz w:val="16"/>
-                <w:szCs w:val="16"/>
-                <w:rtl w:val="0"/>
-              </w:rPr>
-            </w:r>
-            <w:r>
-              <w:rPr>
-                <w:rtl w:val="0"/>
-              </w:rPr>
-            </w:r>
-          </w:p>
-        </w:tc>
-        <w:tc>
-          <w:tcPr/>
-          <w:p>
-            <w:pPr>
-              <w:spacing w:after="24" w:before="24" w:lineRule="auto"/>
-              <w:rPr/>
-            </w:pPr>
-            <w:r>
-              <w:rPr>
+            <w:r>
+              <w:rPr>
+                <w:b/>
+              </w:rPr>
+            </w:r>
+            <w:r>
+              <w:rPr>
+                <w:b/>
+                <w:bCs w:val="1"/>
+                <w:sz w:val="16"/>
+                <w:szCs w:val="16"/>
+                <w:rtl w:val="0"/>
+              </w:rPr>
+            </w:r>
+            <w:r>
+              <w:rPr>
+                <w:b/>
+                <w:rtl w:val="0"/>
+              </w:rPr>
+            </w:r>
+          </w:p>
+        </w:tc>
+        <w:tc>
+          <w:tcPr/>
+          <w:p>
+            <w:pPr>
+              <w:spacing w:after="24" w:before="24" w:lineRule="auto"/>
+              <w:rPr/>
+            </w:pPr>
+            <w:r>
+              <w:rPr>
+                <w:b w:val="0"/>
                 <w:sz w:val="16"/>
                 <w:szCs w:val="16"/>
                 <w:rtl w:val="0"/>
@@ -8086,6 +8164,7 @@
             </w:r>
             <w:r>
               <w:rPr>
+                <w:b w:val="0"/>
                 <w:rtl w:val="0"/>
               </w:rPr>
             </w:r>
@@ -8106,7 +8185,7 @@
             </w:pPr>
             <w:r>
               <w:rPr>
-                <w:b w:val="1"/>
+                <w:b/>
                 <w:bCs w:val="1"/>
                 <w:sz w:val="16"/>
                 <w:szCs w:val="16"/>
@@ -8116,21 +8195,22 @@
             </w:r>
             <w:r>
               <w:rPr>
-                <w:rtl w:val="0"/>
-              </w:rPr>
-            </w:r>
-          </w:p>
-        </w:tc>
-        <w:tc>
-          <w:tcPr/>
-          <w:p>
-            <w:pPr>
-              <w:spacing w:after="24" w:before="24" w:lineRule="auto"/>
-              <w:rPr/>
-            </w:pPr>
-            <w:r>
-              <w:rPr>
-                <w:b w:val="1"/>
+                <w:b/>
+                <w:rtl w:val="0"/>
+              </w:rPr>
+            </w:r>
+          </w:p>
+        </w:tc>
+        <w:tc>
+          <w:tcPr/>
+          <w:p>
+            <w:pPr>
+              <w:spacing w:after="24" w:before="24" w:lineRule="auto"/>
+              <w:rPr/>
+            </w:pPr>
+            <w:r>
+              <w:rPr>
+                <w:b/>
                 <w:bCs w:val="1"/>
                 <w:sz w:val="16"/>
                 <w:szCs w:val="16"/>
@@ -8140,20 +8220,22 @@
             </w:r>
             <w:r>
               <w:rPr>
-                <w:rtl w:val="0"/>
-              </w:rPr>
-            </w:r>
-          </w:p>
-        </w:tc>
-        <w:tc>
-          <w:tcPr/>
-          <w:p>
-            <w:pPr>
-              <w:spacing w:after="24" w:before="24" w:lineRule="auto"/>
-              <w:rPr/>
-            </w:pPr>
-            <w:r>
-              <w:rPr>
+                <w:b/>
+                <w:rtl w:val="0"/>
+              </w:rPr>
+            </w:r>
+          </w:p>
+        </w:tc>
+        <w:tc>
+          <w:tcPr/>
+          <w:p>
+            <w:pPr>
+              <w:spacing w:after="24" w:before="24" w:lineRule="auto"/>
+              <w:rPr/>
+            </w:pPr>
+            <w:r>
+              <w:rPr>
+                <w:b w:val="0"/>
                 <w:sz w:val="16"/>
                 <w:szCs w:val="16"/>
                 <w:rtl w:val="0"/>
@@ -8162,6 +8244,7 @@
             </w:r>
             <w:r>
               <w:rPr>
+                <w:b w:val="0"/>
                 <w:rtl w:val="0"/>
               </w:rPr>
             </w:r>
@@ -8182,6 +8265,7 @@
             </w:pPr>
             <w:r>
               <w:rPr>
+                <w:b/>
                 <w:sz w:val="16"/>
                 <w:szCs w:val="16"/>
                 <w:rtl w:val="0"/>
@@ -8190,20 +8274,22 @@
             </w:r>
             <w:r>
               <w:rPr>
-                <w:rtl w:val="0"/>
-              </w:rPr>
-            </w:r>
-          </w:p>
-        </w:tc>
-        <w:tc>
-          <w:tcPr/>
-          <w:p>
-            <w:pPr>
-              <w:spacing w:after="24" w:before="24" w:lineRule="auto"/>
-              <w:rPr/>
-            </w:pPr>
-            <w:r>
-              <w:rPr>
+                <w:b/>
+                <w:rtl w:val="0"/>
+              </w:rPr>
+            </w:r>
+          </w:p>
+        </w:tc>
+        <w:tc>
+          <w:tcPr/>
+          <w:p>
+            <w:pPr>
+              <w:spacing w:after="24" w:before="24" w:lineRule="auto"/>
+              <w:rPr/>
+            </w:pPr>
+            <w:r>
+              <w:rPr>
+                <w:b/>
                 <w:sz w:val="16"/>
                 <w:szCs w:val="16"/>
                 <w:rtl w:val="0"/>
@@ -8212,20 +8298,22 @@
             </w:r>
             <w:r>
               <w:rPr>
-                <w:rtl w:val="0"/>
-              </w:rPr>
-            </w:r>
-          </w:p>
-        </w:tc>
-        <w:tc>
-          <w:tcPr/>
-          <w:p>
-            <w:pPr>
-              <w:spacing w:after="24" w:before="24" w:lineRule="auto"/>
-              <w:rPr/>
-            </w:pPr>
-            <w:r>
-              <w:rPr>
+                <w:b/>
+                <w:rtl w:val="0"/>
+              </w:rPr>
+            </w:r>
+          </w:p>
+        </w:tc>
+        <w:tc>
+          <w:tcPr/>
+          <w:p>
+            <w:pPr>
+              <w:spacing w:after="24" w:before="24" w:lineRule="auto"/>
+              <w:rPr/>
+            </w:pPr>
+            <w:r>
+              <w:rPr>
+                <w:b w:val="0"/>
                 <w:sz w:val="16"/>
                 <w:szCs w:val="16"/>
                 <w:rtl w:val="0"/>
@@ -8234,6 +8322,7 @@
             </w:r>
             <w:r>
               <w:rPr>
+                <w:b w:val="0"/>
                 <w:rtl w:val="0"/>
               </w:rPr>
             </w:r>
@@ -8254,6 +8343,7 @@
             </w:pPr>
             <w:r>
               <w:rPr>
+                <w:b/>
                 <w:sz w:val="16"/>
                 <w:szCs w:val="16"/>
                 <w:rtl w:val="0"/>
@@ -8262,20 +8352,22 @@
             </w:r>
             <w:r>
               <w:rPr>
-                <w:rtl w:val="0"/>
-              </w:rPr>
-            </w:r>
-          </w:p>
-        </w:tc>
-        <w:tc>
-          <w:tcPr/>
-          <w:p>
-            <w:pPr>
-              <w:spacing w:after="24" w:before="24" w:lineRule="auto"/>
-              <w:rPr/>
-            </w:pPr>
-            <w:r>
-              <w:rPr>
+                <w:b/>
+                <w:rtl w:val="0"/>
+              </w:rPr>
+            </w:r>
+          </w:p>
+        </w:tc>
+        <w:tc>
+          <w:tcPr/>
+          <w:p>
+            <w:pPr>
+              <w:spacing w:after="24" w:before="24" w:lineRule="auto"/>
+              <w:rPr/>
+            </w:pPr>
+            <w:r>
+              <w:rPr>
+                <w:b/>
                 <w:sz w:val="16"/>
                 <w:szCs w:val="16"/>
                 <w:rtl w:val="0"/>
@@ -8284,20 +8376,22 @@
             </w:r>
             <w:r>
               <w:rPr>
-                <w:rtl w:val="0"/>
-              </w:rPr>
-            </w:r>
-          </w:p>
-        </w:tc>
-        <w:tc>
-          <w:tcPr/>
-          <w:p>
-            <w:pPr>
-              <w:spacing w:after="24" w:before="24" w:lineRule="auto"/>
-              <w:rPr/>
-            </w:pPr>
-            <w:r>
-              <w:rPr>
+                <w:b/>
+                <w:rtl w:val="0"/>
+              </w:rPr>
+            </w:r>
+          </w:p>
+        </w:tc>
+        <w:tc>
+          <w:tcPr/>
+          <w:p>
+            <w:pPr>
+              <w:spacing w:after="24" w:before="24" w:lineRule="auto"/>
+              <w:rPr/>
+            </w:pPr>
+            <w:r>
+              <w:rPr>
+                <w:b w:val="0"/>
                 <w:sz w:val="16"/>
                 <w:szCs w:val="16"/>
                 <w:rtl w:val="0"/>
@@ -8306,6 +8400,7 @@
             </w:r>
             <w:r>
               <w:rPr>
+                <w:b w:val="0"/>
                 <w:rtl w:val="0"/>
               </w:rPr>
             </w:r>
@@ -8326,6 +8421,7 @@
             </w:pPr>
             <w:r>
               <w:rPr>
+                <w:b/>
                 <w:sz w:val="16"/>
                 <w:szCs w:val="16"/>
                 <w:rtl w:val="0"/>
@@ -8334,20 +8430,22 @@
             </w:r>
             <w:r>
               <w:rPr>
-                <w:rtl w:val="0"/>
-              </w:rPr>
-            </w:r>
-          </w:p>
-        </w:tc>
-        <w:tc>
-          <w:tcPr/>
-          <w:p>
-            <w:pPr>
-              <w:spacing w:after="24" w:before="24" w:lineRule="auto"/>
-              <w:rPr/>
-            </w:pPr>
-            <w:r>
-              <w:rPr>
+                <w:b/>
+                <w:rtl w:val="0"/>
+              </w:rPr>
+            </w:r>
+          </w:p>
+        </w:tc>
+        <w:tc>
+          <w:tcPr/>
+          <w:p>
+            <w:pPr>
+              <w:spacing w:after="24" w:before="24" w:lineRule="auto"/>
+              <w:rPr/>
+            </w:pPr>
+            <w:r>
+              <w:rPr>
+                <w:b/>
                 <w:sz w:val="16"/>
                 <w:szCs w:val="16"/>
                 <w:rtl w:val="0"/>
@@ -8356,20 +8454,22 @@
             </w:r>
             <w:r>
               <w:rPr>
-                <w:rtl w:val="0"/>
-              </w:rPr>
-            </w:r>
-          </w:p>
-        </w:tc>
-        <w:tc>
-          <w:tcPr/>
-          <w:p>
-            <w:pPr>
-              <w:spacing w:after="24" w:before="24" w:lineRule="auto"/>
-              <w:rPr/>
-            </w:pPr>
-            <w:r>
-              <w:rPr>
+                <w:b/>
+                <w:rtl w:val="0"/>
+              </w:rPr>
+            </w:r>
+          </w:p>
+        </w:tc>
+        <w:tc>
+          <w:tcPr/>
+          <w:p>
+            <w:pPr>
+              <w:spacing w:after="24" w:before="24" w:lineRule="auto"/>
+              <w:rPr/>
+            </w:pPr>
+            <w:r>
+              <w:rPr>
+                <w:b w:val="0"/>
                 <w:sz w:val="16"/>
                 <w:szCs w:val="16"/>
                 <w:rtl w:val="0"/>
@@ -8378,6 +8478,7 @@
             </w:r>
             <w:r>
               <w:rPr>
+                <w:b w:val="0"/>
                 <w:rtl w:val="0"/>
               </w:rPr>
             </w:r>
@@ -8398,6 +8499,7 @@
             </w:pPr>
             <w:r>
               <w:rPr>
+                <w:b/>
                 <w:sz w:val="16"/>
                 <w:szCs w:val="16"/>
                 <w:rtl w:val="0"/>
@@ -8406,20 +8508,22 @@
             </w:r>
             <w:r>
               <w:rPr>
-                <w:rtl w:val="0"/>
-              </w:rPr>
-            </w:r>
-          </w:p>
-        </w:tc>
-        <w:tc>
-          <w:tcPr/>
-          <w:p>
-            <w:pPr>
-              <w:spacing w:after="24" w:before="24" w:lineRule="auto"/>
-              <w:rPr/>
-            </w:pPr>
-            <w:r>
-              <w:rPr>
+                <w:b/>
+                <w:rtl w:val="0"/>
+              </w:rPr>
+            </w:r>
+          </w:p>
+        </w:tc>
+        <w:tc>
+          <w:tcPr/>
+          <w:p>
+            <w:pPr>
+              <w:spacing w:after="24" w:before="24" w:lineRule="auto"/>
+              <w:rPr/>
+            </w:pPr>
+            <w:r>
+              <w:rPr>
+                <w:b/>
                 <w:sz w:val="16"/>
                 <w:szCs w:val="16"/>
                 <w:rtl w:val="0"/>
@@ -8428,20 +8532,22 @@
             </w:r>
             <w:r>
               <w:rPr>
-                <w:rtl w:val="0"/>
-              </w:rPr>
-            </w:r>
-          </w:p>
-        </w:tc>
-        <w:tc>
-          <w:tcPr/>
-          <w:p>
-            <w:pPr>
-              <w:spacing w:after="24" w:before="24" w:lineRule="auto"/>
-              <w:rPr/>
-            </w:pPr>
-            <w:r>
-              <w:rPr>
+                <w:b/>
+                <w:rtl w:val="0"/>
+              </w:rPr>
+            </w:r>
+          </w:p>
+        </w:tc>
+        <w:tc>
+          <w:tcPr/>
+          <w:p>
+            <w:pPr>
+              <w:spacing w:after="24" w:before="24" w:lineRule="auto"/>
+              <w:rPr/>
+            </w:pPr>
+            <w:r>
+              <w:rPr>
+                <w:b w:val="0"/>
                 <w:sz w:val="16"/>
                 <w:szCs w:val="16"/>
                 <w:rtl w:val="0"/>
@@ -8450,6 +8556,7 @@
             </w:r>
             <w:r>
               <w:rPr>
+                <w:b w:val="0"/>
                 <w:rtl w:val="0"/>
               </w:rPr>
             </w:r>
@@ -8474,6 +8581,7 @@
             </w:pPr>
             <w:r>
               <w:rPr>
+                <w:b/>
                 <w:sz w:val="16"/>
                 <w:szCs w:val="16"/>
                 <w:rtl w:val="0"/>
@@ -8482,6 +8590,7 @@
             </w:r>
             <w:r>
               <w:rPr>
+                <w:b/>
                 <w:rtl w:val="0"/>
               </w:rPr>
             </w:r>
@@ -8500,6 +8609,7 @@
             </w:pPr>
             <w:r>
               <w:rPr>
+                <w:b/>
                 <w:sz w:val="16"/>
                 <w:szCs w:val="16"/>
                 <w:rtl w:val="0"/>
@@ -8508,6 +8618,7 @@
             </w:r>
             <w:r>
               <w:rPr>
+                <w:b/>
                 <w:rtl w:val="0"/>
               </w:rPr>
             </w:r>
@@ -8526,6 +8637,7 @@
             </w:pPr>
             <w:r>
               <w:rPr>
+                <w:b w:val="0"/>
                 <w:sz w:val="16"/>
                 <w:szCs w:val="16"/>
                 <w:rtl w:val="0"/>
@@ -8534,6 +8646,7 @@
             </w:r>
             <w:r>
               <w:rPr>
+                <w:b w:val="0"/>
                 <w:rtl w:val="0"/>
               </w:rPr>
             </w:r>
@@ -8777,7 +8890,7 @@
             </w:pPr>
             <w:r>
               <w:rPr>
-                <w:b w:val="1"/>
+                <w:b/>
                 <w:bCs w:val="1"/>
                 <w:sz w:val="16"/>
                 <w:szCs w:val="16"/>
@@ -8787,21 +8900,22 @@
             </w:r>
             <w:r>
               <w:rPr>
-                <w:rtl w:val="0"/>
-              </w:rPr>
-            </w:r>
-          </w:p>
-        </w:tc>
-        <w:tc>
-          <w:tcPr/>
-          <w:p>
-            <w:pPr>
-              <w:spacing w:after="24" w:before="24" w:lineRule="auto"/>
-              <w:rPr/>
-            </w:pPr>
-            <w:r>
-              <w:rPr>
-                <w:b w:val="1"/>
+                <w:b/>
+                <w:rtl w:val="0"/>
+              </w:rPr>
+            </w:r>
+          </w:p>
+        </w:tc>
+        <w:tc>
+          <w:tcPr/>
+          <w:p>
+            <w:pPr>
+              <w:spacing w:after="24" w:before="24" w:lineRule="auto"/>
+              <w:rPr/>
+            </w:pPr>
+            <w:r>
+              <w:rPr>
+                <w:b/>
                 <w:bCs w:val="1"/>
                 <w:sz w:val="16"/>
                 <w:szCs w:val="16"/>
@@ -8811,21 +8925,22 @@
             </w:r>
             <w:r>
               <w:rPr>
-                <w:rtl w:val="0"/>
-              </w:rPr>
-            </w:r>
-          </w:p>
-        </w:tc>
-        <w:tc>
-          <w:tcPr/>
-          <w:p>
-            <w:pPr>
-              <w:spacing w:after="24" w:before="24" w:lineRule="auto"/>
-              <w:rPr/>
-            </w:pPr>
-            <w:r>
-              <w:rPr>
-                <w:b w:val="1"/>
+                <w:b/>
+                <w:rtl w:val="0"/>
+              </w:rPr>
+            </w:r>
+          </w:p>
+        </w:tc>
+        <w:tc>
+          <w:tcPr/>
+          <w:p>
+            <w:pPr>
+              <w:spacing w:after="24" w:before="24" w:lineRule="auto"/>
+              <w:rPr/>
+            </w:pPr>
+            <w:r>
+              <w:rPr>
+                <w:b/>
                 <w:bCs w:val="1"/>
                 <w:sz w:val="16"/>
                 <w:szCs w:val="16"/>
@@ -8835,21 +8950,22 @@
             </w:r>
             <w:r>
               <w:rPr>
-                <w:rtl w:val="0"/>
-              </w:rPr>
-            </w:r>
-          </w:p>
-        </w:tc>
-        <w:tc>
-          <w:tcPr/>
-          <w:p>
-            <w:pPr>
-              <w:spacing w:after="24" w:before="24" w:lineRule="auto"/>
-              <w:rPr/>
-            </w:pPr>
-            <w:r>
-              <w:rPr>
-                <w:b w:val="1"/>
+                <w:b/>
+                <w:rtl w:val="0"/>
+              </w:rPr>
+            </w:r>
+          </w:p>
+        </w:tc>
+        <w:tc>
+          <w:tcPr/>
+          <w:p>
+            <w:pPr>
+              <w:spacing w:after="24" w:before="24" w:lineRule="auto"/>
+              <w:rPr/>
+            </w:pPr>
+            <w:r>
+              <w:rPr>
+                <w:b/>
                 <w:bCs w:val="1"/>
                 <w:sz w:val="16"/>
                 <w:szCs w:val="16"/>
@@ -8859,21 +8975,22 @@
             </w:r>
             <w:r>
               <w:rPr>
-                <w:rtl w:val="0"/>
-              </w:rPr>
-            </w:r>
-          </w:p>
-        </w:tc>
-        <w:tc>
-          <w:tcPr/>
-          <w:p>
-            <w:pPr>
-              <w:spacing w:after="24" w:before="24" w:lineRule="auto"/>
-              <w:rPr/>
-            </w:pPr>
-            <w:r>
-              <w:rPr>
-                <w:b w:val="1"/>
+                <w:b/>
+                <w:rtl w:val="0"/>
+              </w:rPr>
+            </w:r>
+          </w:p>
+        </w:tc>
+        <w:tc>
+          <w:tcPr/>
+          <w:p>
+            <w:pPr>
+              <w:spacing w:after="24" w:before="24" w:lineRule="auto"/>
+              <w:rPr/>
+            </w:pPr>
+            <w:r>
+              <w:rPr>
+                <w:b/>
                 <w:bCs w:val="1"/>
                 <w:sz w:val="16"/>
                 <w:szCs w:val="16"/>
@@ -8883,6 +9000,7 @@
             </w:r>
             <w:r>
               <w:rPr>
+                <w:b/>
                 <w:rtl w:val="0"/>
               </w:rPr>
             </w:r>
@@ -8903,6 +9021,7 @@
             </w:pPr>
             <w:r>
               <w:rPr>
+                <w:b w:val="0"/>
                 <w:sz w:val="16"/>
                 <w:szCs w:val="16"/>
                 <w:rtl w:val="0"/>
@@ -8911,20 +9030,22 @@
             </w:r>
             <w:r>
               <w:rPr>
-                <w:rtl w:val="0"/>
-              </w:rPr>
-            </w:r>
-          </w:p>
-        </w:tc>
-        <w:tc>
-          <w:tcPr/>
-          <w:p>
-            <w:pPr>
-              <w:spacing w:after="24" w:before="24" w:lineRule="auto"/>
-              <w:rPr/>
-            </w:pPr>
-            <w:r>
-              <w:rPr>
+                <w:b w:val="0"/>
+                <w:rtl w:val="0"/>
+              </w:rPr>
+            </w:r>
+          </w:p>
+        </w:tc>
+        <w:tc>
+          <w:tcPr/>
+          <w:p>
+            <w:pPr>
+              <w:spacing w:after="24" w:before="24" w:lineRule="auto"/>
+              <w:rPr/>
+            </w:pPr>
+            <w:r>
+              <w:rPr>
+                <w:b w:val="0"/>
                 <w:sz w:val="16"/>
                 <w:szCs w:val="16"/>
                 <w:rtl w:val="0"/>
@@ -8933,20 +9054,22 @@
             </w:r>
             <w:r>
               <w:rPr>
-                <w:rtl w:val="0"/>
-              </w:rPr>
-            </w:r>
-          </w:p>
-        </w:tc>
-        <w:tc>
-          <w:tcPr/>
-          <w:p>
-            <w:pPr>
-              <w:spacing w:after="24" w:before="24" w:lineRule="auto"/>
-              <w:rPr/>
-            </w:pPr>
-            <w:r>
-              <w:rPr>
+                <w:b w:val="0"/>
+                <w:rtl w:val="0"/>
+              </w:rPr>
+            </w:r>
+          </w:p>
+        </w:tc>
+        <w:tc>
+          <w:tcPr/>
+          <w:p>
+            <w:pPr>
+              <w:spacing w:after="24" w:before="24" w:lineRule="auto"/>
+              <w:rPr/>
+            </w:pPr>
+            <w:r>
+              <w:rPr>
+                <w:b w:val="0"/>
                 <w:sz w:val="16"/>
                 <w:szCs w:val="16"/>
                 <w:rtl w:val="0"/>
@@ -8955,20 +9078,22 @@
             </w:r>
             <w:r>
               <w:rPr>
-                <w:rtl w:val="0"/>
-              </w:rPr>
-            </w:r>
-          </w:p>
-        </w:tc>
-        <w:tc>
-          <w:tcPr/>
-          <w:p>
-            <w:pPr>
-              <w:spacing w:after="24" w:before="24" w:lineRule="auto"/>
-              <w:rPr/>
-            </w:pPr>
-            <w:r>
-              <w:rPr>
+                <w:b w:val="0"/>
+                <w:rtl w:val="0"/>
+              </w:rPr>
+            </w:r>
+          </w:p>
+        </w:tc>
+        <w:tc>
+          <w:tcPr/>
+          <w:p>
+            <w:pPr>
+              <w:spacing w:after="24" w:before="24" w:lineRule="auto"/>
+              <w:rPr/>
+            </w:pPr>
+            <w:r>
+              <w:rPr>
+                <w:b w:val="0"/>
                 <w:sz w:val="16"/>
                 <w:szCs w:val="16"/>
                 <w:rtl w:val="0"/>
@@ -8977,20 +9102,22 @@
             </w:r>
             <w:r>
               <w:rPr>
-                <w:rtl w:val="0"/>
-              </w:rPr>
-            </w:r>
-          </w:p>
-        </w:tc>
-        <w:tc>
-          <w:tcPr/>
-          <w:p>
-            <w:pPr>
-              <w:spacing w:after="24" w:before="24" w:lineRule="auto"/>
-              <w:rPr/>
-            </w:pPr>
-            <w:r>
-              <w:rPr>
+                <w:b w:val="0"/>
+                <w:rtl w:val="0"/>
+              </w:rPr>
+            </w:r>
+          </w:p>
+        </w:tc>
+        <w:tc>
+          <w:tcPr/>
+          <w:p>
+            <w:pPr>
+              <w:spacing w:after="24" w:before="24" w:lineRule="auto"/>
+              <w:rPr/>
+            </w:pPr>
+            <w:r>
+              <w:rPr>
+                <w:b w:val="0"/>
                 <w:sz w:val="16"/>
                 <w:szCs w:val="16"/>
                 <w:rtl w:val="0"/>
@@ -8999,6 +9126,7 @@
             </w:r>
             <w:r>
               <w:rPr>
+                <w:b w:val="0"/>
                 <w:rtl w:val="0"/>
               </w:rPr>
             </w:r>
@@ -9019,6 +9147,7 @@
             </w:pPr>
             <w:r>
               <w:rPr>
+                <w:b w:val="0"/>
                 <w:sz w:val="16"/>
                 <w:szCs w:val="16"/>
                 <w:rtl w:val="0"/>
@@ -9027,20 +9156,22 @@
             </w:r>
             <w:r>
               <w:rPr>
-                <w:rtl w:val="0"/>
-              </w:rPr>
-            </w:r>
-          </w:p>
-        </w:tc>
-        <w:tc>
-          <w:tcPr/>
-          <w:p>
-            <w:pPr>
-              <w:spacing w:after="24" w:before="24" w:lineRule="auto"/>
-              <w:rPr/>
-            </w:pPr>
-            <w:r>
-              <w:rPr>
+                <w:b w:val="0"/>
+                <w:rtl w:val="0"/>
+              </w:rPr>
+            </w:r>
+          </w:p>
+        </w:tc>
+        <w:tc>
+          <w:tcPr/>
+          <w:p>
+            <w:pPr>
+              <w:spacing w:after="24" w:before="24" w:lineRule="auto"/>
+              <w:rPr/>
+            </w:pPr>
+            <w:r>
+              <w:rPr>
+                <w:b w:val="0"/>
                 <w:sz w:val="16"/>
                 <w:szCs w:val="16"/>
                 <w:rtl w:val="0"/>
@@ -9049,20 +9180,22 @@
             </w:r>
             <w:r>
               <w:rPr>
-                <w:rtl w:val="0"/>
-              </w:rPr>
-            </w:r>
-          </w:p>
-        </w:tc>
-        <w:tc>
-          <w:tcPr/>
-          <w:p>
-            <w:pPr>
-              <w:spacing w:after="24" w:before="24" w:lineRule="auto"/>
-              <w:rPr/>
-            </w:pPr>
-            <w:r>
-              <w:rPr>
+                <w:b w:val="0"/>
+                <w:rtl w:val="0"/>
+              </w:rPr>
+            </w:r>
+          </w:p>
+        </w:tc>
+        <w:tc>
+          <w:tcPr/>
+          <w:p>
+            <w:pPr>
+              <w:spacing w:after="24" w:before="24" w:lineRule="auto"/>
+              <w:rPr/>
+            </w:pPr>
+            <w:r>
+              <w:rPr>
+                <w:b w:val="0"/>
                 <w:sz w:val="16"/>
                 <w:szCs w:val="16"/>
                 <w:rtl w:val="0"/>
@@ -9071,20 +9204,22 @@
             </w:r>
             <w:r>
               <w:rPr>
-                <w:rtl w:val="0"/>
-              </w:rPr>
-            </w:r>
-          </w:p>
-        </w:tc>
-        <w:tc>
-          <w:tcPr/>
-          <w:p>
-            <w:pPr>
-              <w:spacing w:after="24" w:before="24" w:lineRule="auto"/>
-              <w:rPr/>
-            </w:pPr>
-            <w:r>
-              <w:rPr>
+                <w:b w:val="0"/>
+                <w:rtl w:val="0"/>
+              </w:rPr>
+            </w:r>
+          </w:p>
+        </w:tc>
+        <w:tc>
+          <w:tcPr/>
+          <w:p>
+            <w:pPr>
+              <w:spacing w:after="24" w:before="24" w:lineRule="auto"/>
+              <w:rPr/>
+            </w:pPr>
+            <w:r>
+              <w:rPr>
+                <w:b w:val="0"/>
                 <w:sz w:val="16"/>
                 <w:szCs w:val="16"/>
                 <w:rtl w:val="0"/>
@@ -9093,20 +9228,22 @@
             </w:r>
             <w:r>
               <w:rPr>
-                <w:rtl w:val="0"/>
-              </w:rPr>
-            </w:r>
-          </w:p>
-        </w:tc>
-        <w:tc>
-          <w:tcPr/>
-          <w:p>
-            <w:pPr>
-              <w:spacing w:after="24" w:before="24" w:lineRule="auto"/>
-              <w:rPr/>
-            </w:pPr>
-            <w:r>
-              <w:rPr>
+                <w:b w:val="0"/>
+                <w:rtl w:val="0"/>
+              </w:rPr>
+            </w:r>
+          </w:p>
+        </w:tc>
+        <w:tc>
+          <w:tcPr/>
+          <w:p>
+            <w:pPr>
+              <w:spacing w:after="24" w:before="24" w:lineRule="auto"/>
+              <w:rPr/>
+            </w:pPr>
+            <w:r>
+              <w:rPr>
+                <w:b w:val="0"/>
                 <w:sz w:val="16"/>
                 <w:szCs w:val="16"/>
                 <w:rtl w:val="0"/>
@@ -9115,6 +9252,7 @@
             </w:r>
             <w:r>
               <w:rPr>
+                <w:b w:val="0"/>
                 <w:rtl w:val="0"/>
               </w:rPr>
             </w:r>
@@ -9135,6 +9273,7 @@
             </w:pPr>
             <w:r>
               <w:rPr>
+                <w:b w:val="0"/>
                 <w:sz w:val="16"/>
                 <w:szCs w:val="16"/>
                 <w:rtl w:val="0"/>
@@ -9143,20 +9282,22 @@
             </w:r>
             <w:r>
               <w:rPr>
-                <w:rtl w:val="0"/>
-              </w:rPr>
-            </w:r>
-          </w:p>
-        </w:tc>
-        <w:tc>
-          <w:tcPr/>
-          <w:p>
-            <w:pPr>
-              <w:spacing w:after="24" w:before="24" w:lineRule="auto"/>
-              <w:rPr/>
-            </w:pPr>
-            <w:r>
-              <w:rPr>
+                <w:b w:val="0"/>
+                <w:rtl w:val="0"/>
+              </w:rPr>
+            </w:r>
+          </w:p>
+        </w:tc>
+        <w:tc>
+          <w:tcPr/>
+          <w:p>
+            <w:pPr>
+              <w:spacing w:after="24" w:before="24" w:lineRule="auto"/>
+              <w:rPr/>
+            </w:pPr>
+            <w:r>
+              <w:rPr>
+                <w:b w:val="0"/>
                 <w:sz w:val="16"/>
                 <w:szCs w:val="16"/>
                 <w:rtl w:val="0"/>
@@ -9165,20 +9306,22 @@
             </w:r>
             <w:r>
               <w:rPr>
-                <w:rtl w:val="0"/>
-              </w:rPr>
-            </w:r>
-          </w:p>
-        </w:tc>
-        <w:tc>
-          <w:tcPr/>
-          <w:p>
-            <w:pPr>
-              <w:spacing w:after="24" w:before="24" w:lineRule="auto"/>
-              <w:rPr/>
-            </w:pPr>
-            <w:r>
-              <w:rPr>
+                <w:b w:val="0"/>
+                <w:rtl w:val="0"/>
+              </w:rPr>
+            </w:r>
+          </w:p>
+        </w:tc>
+        <w:tc>
+          <w:tcPr/>
+          <w:p>
+            <w:pPr>
+              <w:spacing w:after="24" w:before="24" w:lineRule="auto"/>
+              <w:rPr/>
+            </w:pPr>
+            <w:r>
+              <w:rPr>
+                <w:b w:val="0"/>
                 <w:sz w:val="16"/>
                 <w:szCs w:val="16"/>
                 <w:rtl w:val="0"/>
@@ -9187,20 +9330,22 @@
             </w:r>
             <w:r>
               <w:rPr>
-                <w:rtl w:val="0"/>
-              </w:rPr>
-            </w:r>
-          </w:p>
-        </w:tc>
-        <w:tc>
-          <w:tcPr/>
-          <w:p>
-            <w:pPr>
-              <w:spacing w:after="24" w:before="24" w:lineRule="auto"/>
-              <w:rPr/>
-            </w:pPr>
-            <w:r>
-              <w:rPr>
+                <w:b w:val="0"/>
+                <w:rtl w:val="0"/>
+              </w:rPr>
+            </w:r>
+          </w:p>
+        </w:tc>
+        <w:tc>
+          <w:tcPr/>
+          <w:p>
+            <w:pPr>
+              <w:spacing w:after="24" w:before="24" w:lineRule="auto"/>
+              <w:rPr/>
+            </w:pPr>
+            <w:r>
+              <w:rPr>
+                <w:b w:val="0"/>
                 <w:sz w:val="16"/>
                 <w:szCs w:val="16"/>
                 <w:rtl w:val="0"/>
@@ -9209,20 +9354,22 @@
             </w:r>
             <w:r>
               <w:rPr>
-                <w:rtl w:val="0"/>
-              </w:rPr>
-            </w:r>
-          </w:p>
-        </w:tc>
-        <w:tc>
-          <w:tcPr/>
-          <w:p>
-            <w:pPr>
-              <w:spacing w:after="24" w:before="24" w:lineRule="auto"/>
-              <w:rPr/>
-            </w:pPr>
-            <w:r>
-              <w:rPr>
+                <w:b w:val="0"/>
+                <w:rtl w:val="0"/>
+              </w:rPr>
+            </w:r>
+          </w:p>
+        </w:tc>
+        <w:tc>
+          <w:tcPr/>
+          <w:p>
+            <w:pPr>
+              <w:spacing w:after="24" w:before="24" w:lineRule="auto"/>
+              <w:rPr/>
+            </w:pPr>
+            <w:r>
+              <w:rPr>
+                <w:b w:val="0"/>
                 <w:sz w:val="16"/>
                 <w:szCs w:val="16"/>
                 <w:rtl w:val="0"/>
@@ -9231,6 +9378,7 @@
             </w:r>
             <w:r>
               <w:rPr>
+                <w:b w:val="0"/>
                 <w:rtl w:val="0"/>
               </w:rPr>
             </w:r>
@@ -9251,6 +9399,7 @@
             </w:pPr>
             <w:r>
               <w:rPr>
+                <w:b w:val="0"/>
                 <w:sz w:val="16"/>
                 <w:szCs w:val="16"/>
                 <w:rtl w:val="0"/>
@@ -9259,20 +9408,22 @@
             </w:r>
             <w:r>
               <w:rPr>
-                <w:rtl w:val="0"/>
-              </w:rPr>
-            </w:r>
-          </w:p>
-        </w:tc>
-        <w:tc>
-          <w:tcPr/>
-          <w:p>
-            <w:pPr>
-              <w:spacing w:after="24" w:before="24" w:lineRule="auto"/>
-              <w:rPr/>
-            </w:pPr>
-            <w:r>
-              <w:rPr>
+                <w:b w:val="0"/>
+                <w:rtl w:val="0"/>
+              </w:rPr>
+            </w:r>
+          </w:p>
+        </w:tc>
+        <w:tc>
+          <w:tcPr/>
+          <w:p>
+            <w:pPr>
+              <w:spacing w:after="24" w:before="24" w:lineRule="auto"/>
+              <w:rPr/>
+            </w:pPr>
+            <w:r>
+              <w:rPr>
+                <w:b w:val="0"/>
                 <w:sz w:val="16"/>
                 <w:szCs w:val="16"/>
                 <w:rtl w:val="0"/>
@@ -9281,20 +9432,22 @@
             </w:r>
             <w:r>
               <w:rPr>
-                <w:rtl w:val="0"/>
-              </w:rPr>
-            </w:r>
-          </w:p>
-        </w:tc>
-        <w:tc>
-          <w:tcPr/>
-          <w:p>
-            <w:pPr>
-              <w:spacing w:after="24" w:before="24" w:lineRule="auto"/>
-              <w:rPr/>
-            </w:pPr>
-            <w:r>
-              <w:rPr>
+                <w:b w:val="0"/>
+                <w:rtl w:val="0"/>
+              </w:rPr>
+            </w:r>
+          </w:p>
+        </w:tc>
+        <w:tc>
+          <w:tcPr/>
+          <w:p>
+            <w:pPr>
+              <w:spacing w:after="24" w:before="24" w:lineRule="auto"/>
+              <w:rPr/>
+            </w:pPr>
+            <w:r>
+              <w:rPr>
+                <w:b w:val="0"/>
                 <w:sz w:val="16"/>
                 <w:szCs w:val="16"/>
                 <w:rtl w:val="0"/>
@@ -9303,20 +9456,22 @@
             </w:r>
             <w:r>
               <w:rPr>
-                <w:rtl w:val="0"/>
-              </w:rPr>
-            </w:r>
-          </w:p>
-        </w:tc>
-        <w:tc>
-          <w:tcPr/>
-          <w:p>
-            <w:pPr>
-              <w:spacing w:after="24" w:before="24" w:lineRule="auto"/>
-              <w:rPr/>
-            </w:pPr>
-            <w:r>
-              <w:rPr>
+                <w:b w:val="0"/>
+                <w:rtl w:val="0"/>
+              </w:rPr>
+            </w:r>
+          </w:p>
+        </w:tc>
+        <w:tc>
+          <w:tcPr/>
+          <w:p>
+            <w:pPr>
+              <w:spacing w:after="24" w:before="24" w:lineRule="auto"/>
+              <w:rPr/>
+            </w:pPr>
+            <w:r>
+              <w:rPr>
+                <w:b w:val="0"/>
                 <w:sz w:val="16"/>
                 <w:szCs w:val="16"/>
                 <w:rtl w:val="0"/>
@@ -9325,20 +9480,22 @@
             </w:r>
             <w:r>
               <w:rPr>
-                <w:rtl w:val="0"/>
-              </w:rPr>
-            </w:r>
-          </w:p>
-        </w:tc>
-        <w:tc>
-          <w:tcPr/>
-          <w:p>
-            <w:pPr>
-              <w:spacing w:after="24" w:before="24" w:lineRule="auto"/>
-              <w:rPr/>
-            </w:pPr>
-            <w:r>
-              <w:rPr>
+                <w:b w:val="0"/>
+                <w:rtl w:val="0"/>
+              </w:rPr>
+            </w:r>
+          </w:p>
+        </w:tc>
+        <w:tc>
+          <w:tcPr/>
+          <w:p>
+            <w:pPr>
+              <w:spacing w:after="24" w:before="24" w:lineRule="auto"/>
+              <w:rPr/>
+            </w:pPr>
+            <w:r>
+              <w:rPr>
+                <w:b w:val="0"/>
                 <w:sz w:val="16"/>
                 <w:szCs w:val="16"/>
                 <w:rtl w:val="0"/>
@@ -9347,6 +9504,7 @@
             </w:r>
             <w:r>
               <w:rPr>
+                <w:b w:val="0"/>
                 <w:rtl w:val="0"/>
               </w:rPr>
             </w:r>
@@ -9371,6 +9529,7 @@
             </w:pPr>
             <w:r>
               <w:rPr>
+                <w:b w:val="0"/>
                 <w:sz w:val="16"/>
                 <w:szCs w:val="16"/>
                 <w:rtl w:val="0"/>
@@ -9379,6 +9538,7 @@
             </w:r>
             <w:r>
               <w:rPr>
+                <w:b w:val="0"/>
                 <w:rtl w:val="0"/>
               </w:rPr>
             </w:r>
@@ -9397,6 +9557,7 @@
             </w:pPr>
             <w:r>
               <w:rPr>
+                <w:b w:val="0"/>
                 <w:sz w:val="16"/>
                 <w:szCs w:val="16"/>
                 <w:rtl w:val="0"/>
@@ -9405,6 +9566,7 @@
             </w:r>
             <w:r>
               <w:rPr>
+                <w:b w:val="0"/>
                 <w:rtl w:val="0"/>
               </w:rPr>
             </w:r>
@@ -9423,6 +9585,7 @@
             </w:pPr>
             <w:r>
               <w:rPr>
+                <w:b w:val="0"/>
                 <w:sz w:val="16"/>
                 <w:szCs w:val="16"/>
                 <w:rtl w:val="0"/>
@@ -9431,6 +9594,7 @@
             </w:r>
             <w:r>
               <w:rPr>
+                <w:b w:val="0"/>
                 <w:rtl w:val="0"/>
               </w:rPr>
             </w:r>
@@ -9449,6 +9613,7 @@
             </w:pPr>
             <w:r>
               <w:rPr>
+                <w:b w:val="0"/>
                 <w:sz w:val="16"/>
                 <w:szCs w:val="16"/>
                 <w:rtl w:val="0"/>
@@ -9457,6 +9622,7 @@
             </w:r>
             <w:r>
               <w:rPr>
+                <w:b w:val="0"/>
                 <w:rtl w:val="0"/>
               </w:rPr>
             </w:r>
@@ -9475,6 +9641,7 @@
             </w:pPr>
             <w:r>
               <w:rPr>
+                <w:b w:val="0"/>
                 <w:sz w:val="16"/>
                 <w:szCs w:val="16"/>
                 <w:rtl w:val="0"/>
@@ -9483,6 +9650,7 @@
             </w:r>
             <w:r>
               <w:rPr>
+                <w:b w:val="0"/>
                 <w:rtl w:val="0"/>
               </w:rPr>
             </w:r>

</xml_diff>